<commit_message>
Update Bible study notes for arb, eng, fra, hin, ind, por, rus, spa, swh, and zht languages for 2026-04-21 release
</commit_message>
<xml_diff>
--- a/arb/docx/41.content.docx
+++ b/arb/docx/41.content.docx
@@ -33468,7 +33468,7 @@
         <w:rPr>
           <w:lang w:val="ar_AE" w:bidi="ar_AE"/>
         </w:rPr>
-        <w:t xml:space="preserve">مهما كان ما سيختبره يعقوب ويوحنا، لم يكن لدى يسوع السلطة لتلبية طلبهما، فوحده الله الآب يستطيع ذلك (انظر أيضًا </w:t>
+        <w:t xml:space="preserve">لم يستجب يسوع لطلبهما، لأنّ هذه المكانة مُعدّة لأولئك الذين أعدّها الله الآب لهم (انظر أيضًا </w:t>
       </w:r>
       <w:hyperlink r:id="rId711">
         <w:r>
@@ -45897,31 +45897,7 @@
         <w:rPr>
           <w:lang w:val="ar_AE" w:bidi="ar_AE"/>
         </w:rPr>
-        <w:t xml:space="preserve">): نبه مرقس قرّاءه الأصليين إلى الانتباه إلى وصفه لهذه العلامة، مما يدل على أن التعبير كان يتطلب تفكيراً دقيقاً وتمييزاً. كان على قرّاء مرقس أن يبحثوا عن علامة مشابهة لما حدث في زمن أنطيخوس إبيفانيوس. • على الرغم من أن عبارة </w:t>
-      </w:r>
-      <w:r>
-        <w:rPr>
-          <w:lang w:val="ar_AE" w:bidi="ar_AE"/>
-        </w:rPr>
-        <w:t>رِجسَةَ الخَرابِ</w:t>
-      </w:r>
-      <w:r>
-        <w:rPr>
-          <w:lang w:val="ar_AE" w:bidi="ar_AE"/>
-        </w:rPr>
-        <w:t xml:space="preserve"> هي محايدة نحويًا، فإن كلمة </w:t>
-      </w:r>
-      <w:r>
-        <w:rPr>
-          <w:lang w:val="ar_AE" w:bidi="ar_AE"/>
-        </w:rPr>
-        <w:t>قائمَةً</w:t>
-      </w:r>
-      <w:r>
-        <w:rPr>
-          <w:lang w:val="ar_AE" w:bidi="ar_AE"/>
-        </w:rPr>
-        <w:t xml:space="preserve"> هي مذكرة نحويًا في اليونانية، لذا فهي تشير إلى شخص وليس إلى شيء. تشمل الاقتراحات حول من قد يكون: (1) الإمبراطور كاليجولا، الذي حاول في عام 39–40 ميلادي إقامة تمثال لنفسه في الهيكل (يوسيفوس، </w:t>
+        <w:t xml:space="preserve">): نبه مرقس قرّاءه الأصليين إلى الانتباه إلى وصفه لهذه العلامة، مما يدل على أن التعبير كان يتطلب تفكيراً دقيقاً وتمييزاً. كان على قرّاء مرقس أن يبحثوا عن علامة مشابهة لما حدث في زمن أنطيخوس إبيفانيوس. • على الرغم من أنّ عبارة «رجسة الخراب» تأتي من الناحية النحويّة في اللغة الأصليّة بصيغة المحايد، فإنّ كلمة «قَائِمَة» وردت بصيغة المذكّر. وقد يوحي ذلك بوجود شخص يقف وراء هذا الفعل، غير أنّ الأمر ليس مؤكَّدًا؛ إذ يمكن للعبارة أيضًا أن تشير إلى شيءٍ أو حدثٍ معيَّن.ء. تشمل الاقتراحات حول من قد يكون: (1) الإمبراطور كاليجولا، الذي حاول في عام 39–40 ميلادي إقامة تمثال لنفسه في الهيكل (يوسيفوس، </w:t>
       </w:r>
       <w:r>
         <w:rPr>

</xml_diff>

<commit_message>
Update Bible study notes for Arabic, English, French, Hindi, Indonesian, Portuguese, Russian, Swahili, Spanish, and Chinese on 2026-05-26
</commit_message>
<xml_diff>
--- a/arb/docx/41.content.docx
+++ b/arb/docx/41.content.docx
@@ -50890,33 +50890,7 @@
         <w:rPr>
           <w:lang w:val="ar_AE" w:bidi="ar_AE"/>
         </w:rPr>
-        <w:t>بدأ العشاء الأخير بمباركة. في الممارسة الحديثة، يطلب المسيحيون من الله أن يبارك الطعام؛ كان اليهود في أيام يسوع يباركون الله على تقديم الطعام بالكلمات: "مبارك أنت أيها الرب إلهنا ملك الكون الذي يخرج الخبز من الأرض". • هذا هو جسدي. … هذا هو دمي: البعض يفهم هذه الكلمات على أنها تعني أن الخبز والنبيذ يتحولان إلى جسد ودم يسوع الحقيقيين (</w:t>
-      </w:r>
-      <w:r>
-        <w:rPr>
-          <w:i/>
-          <w:lang w:val="ar_AE" w:bidi="ar_AE"/>
-        </w:rPr>
-        <w:t>التحول الجوهري</w:t>
-      </w:r>
-      <w:r>
-        <w:rPr>
-          <w:lang w:val="ar_AE" w:bidi="ar_AE"/>
-        </w:rPr>
-        <w:t>); آخرون، أن الخبز والنبيذ يبقيان خبزًا ونبيذًا ولكن الحضور الحقيقي ليسوع يوجد فيهما (</w:t>
-      </w:r>
-      <w:r>
-        <w:rPr>
-          <w:i/>
-          <w:lang w:val="ar_AE" w:bidi="ar_AE"/>
-        </w:rPr>
-        <w:t>الاتحاد الجوهري</w:t>
-      </w:r>
-      <w:r>
-        <w:rPr>
-          <w:lang w:val="ar_AE" w:bidi="ar_AE"/>
-        </w:rPr>
-        <w:t xml:space="preserve">). في هاتين النظرتين، عندما يشارك المرء في العشاء الرباني، فإنه يأكل ويشرب جسد يسوع ودمه بالفعل. توجد وجهة نظر ثالثة هي أن المسيحيين يتغذون روحياً على يسوع عند تناول الخبز والخمر. الرأي الرابع هو أن العشاء هو في المقام الأول تذكاري، والعناصر هي رمز لتضحية يسوع نيابة عنا. انظر أيضًا </w:t>
+        <w:t xml:space="preserve">بدأ العشاء الأخير بمباركة. في الممارسة الحديثة، يطلب المسيحيون من الله أن يبارك الطعام؛ كان اليهود في أيام يسوع يباركون الله على تقديم الطعام بالكلمات: "مبارك أنت أيها الرب إلهنا ملك الكون الذي يخرج الخبز من الأرض". • هذا هو جسدي. … هذا هو دمي: لإصلاح، كانت هناك ثلاث تفسيرات رئيسية موجودة لتصريحات يسوع بشأن الخبز والخمر: (1) أن الخبز والخمر يتحولان إلى جسد ودم يسوع المسيح الفعليين (الاستحالة); (2) أنَّ المسيح حاضرٌ حقًّا في السرّ المقدّس (العشاء الرباني) حضورًا حقيقيًّا وسريًّا يتجاوز إدراك العقل البشري، أو ما يُعرَف بـ(الحضور الحقيقي)؛ (3) أن الخبز والخمر يرمزان إلى جسد ودم المسيح، وهو ما يفيد المتلقي من خلال عمل الروح بالإيمان (الرمزية). انظر أيضًا </w:t>
       </w:r>
       <w:hyperlink r:id="rId1094">
         <w:r>
@@ -50930,18 +50904,6 @@
           <w:t>يوحنا 6: 53–63</w:t>
         </w:r>
       </w:hyperlink>
-      <w:r>
-        <w:rPr>
-          <w:lang w:val="ar_AE" w:bidi="ar_AE"/>
-        </w:rPr>
-        <w:t xml:space="preserve"> و</w:t>
-      </w:r>
-      <w:r>
-        <w:rPr>
-          <w:lang w:val="ar_AE" w:bidi="ar_AE"/>
-        </w:rPr>
-        <w:t>ملاحظة الدراسة المقابلة</w:t>
-      </w:r>
       <w:r>
         <w:rPr>
           <w:lang w:val="ar_AE" w:bidi="ar_AE"/>

</xml_diff>